<commit_message>
Auto update ODK data, analysis outputs, and report
</commit_message>
<xml_diff>
--- a/output/consolidated_report.docx
+++ b/output/consolidated_report.docx
@@ -16,7 +16,16 @@
         <w:spacing w:after="120" w:line="259" w:lineRule="auto"/>
       </w:pPr>
       <w:r>
-        <w:t>This report compiles the analysis CSV outputs into plain-text sections for direct pasting into Word.</w:t>
+        <w:t>This report compiles the analysis CSV outputs into plain-text sections.</w:t>
+      </w:r>
+    </w:p>
+    <w:p>
+      <w:pPr>
+        <w:pStyle w:val="Heading1"/>
+        <w:spacing w:after="200"/>
+      </w:pPr>
+      <w:r>
+        <w:t>Section 1: Descriptive Statistics</w:t>
       </w:r>
     </w:p>
     <w:p>
@@ -15837,10 +15846,19 @@
     </w:p>
     <w:p>
       <w:pPr>
-        <w:spacing w:after="120" w:line="259" w:lineRule="auto"/>
-      </w:pPr>
-      <w:r>
-        <w:t>Reliability (Cronbach's Alpha)</w:t>
+        <w:pStyle w:val="Heading1"/>
+        <w:spacing w:after="200"/>
+      </w:pPr>
+      <w:r>
+        <w:t>Section 3: Reliability (Cronbach's Alpha)</w:t>
+      </w:r>
+    </w:p>
+    <w:p>
+      <w:pPr>
+        <w:spacing w:after="120" w:line="259" w:lineRule="auto"/>
+      </w:pPr>
+      <w:r>
+        <w:t>Reliability (Cronbach's Alpha) — Overall</w:t>
       </w:r>
     </w:p>
     <w:p>
@@ -16088,23 +16106,32 @@
         <w:spacing w:after="120" w:line="259" w:lineRule="auto"/>
       </w:pPr>
       <w:r>
-        <w:t>Reliability estimates are presented above for the available adolescent scales. Scales in the acceptable-to-good range included: PHQ9, PSC, RCADS, DSM-5, WEMWBS, SPSI, BBSCQ, Psychlops-Post, SRQ, APQ, BBSCQ, PHQ9, PSC, RCADS, DSM-5, Somatic, WEMWBS, SPSI, IBS, BBSCQ, SRQ, APQ, BBSCQ. Borderline scales included: Somatic, IBS, Self Stigma, Self Stigma.</w:t>
-      </w:r>
-    </w:p>
-    <w:p>
-      <w:pPr>
-        <w:spacing w:after="120" w:line="259" w:lineRule="auto"/>
-      </w:pPr>
-      <w:r>
-        <w:t>Group-wise Welch's and Student's t-tests</w:t>
-      </w:r>
-    </w:p>
-    <w:p>
-      <w:pPr>
-        <w:spacing w:after="120" w:line="259" w:lineRule="auto"/>
-      </w:pPr>
-      <w:r>
-        <w:t>Form | Variable | Group A Mean [SD] | Group B Mean [SD] | Mean Difference | Welch's t(df) | Welch's p | Welch's significance | Student's t(df) | Student's p | Student's significance</w:t>
+        <w:t>Reliability estimates are presented above for the available scales. Scales in the acceptable-to-good range: PHQ9, PSC, RCADS, DSM-5, WEMWBS, SPSI, BBSCQ, Psychlops-Post, SRQ, APQ, BBSCQ, PHQ9, PSC, RCADS, DSM-5, Somatic, WEMWBS, SPSI, IBS, BBSCQ, SRQ, APQ, BBSCQ. Borderline scales: Somatic, IBS, Self Stigma, Self Stigma.</w:t>
+      </w:r>
+    </w:p>
+    <w:p>
+      <w:pPr>
+        <w:pStyle w:val="Heading1"/>
+        <w:spacing w:after="200"/>
+      </w:pPr>
+      <w:r>
+        <w:t>Section 5: Group A vs Group B t-tests</w:t>
+      </w:r>
+    </w:p>
+    <w:p>
+      <w:pPr>
+        <w:spacing w:after="120" w:line="259" w:lineRule="auto"/>
+      </w:pPr>
+      <w:r>
+        <w:t>Group-wise Welch's and Student's t-tests (Group A vs Group B)</w:t>
+      </w:r>
+    </w:p>
+    <w:p>
+      <w:pPr>
+        <w:spacing w:after="120" w:line="259" w:lineRule="auto"/>
+      </w:pPr>
+      <w:r>
+        <w:t>Form | Variable | Group A Mean [SD] | Group B Mean [SD] | Mean Difference | Welch's t(df) | Welch's p | Welch's sig | Student's t(df) | Student's p | Student's sig</w:t>
       </w:r>
     </w:p>
     <w:p>
@@ -16392,7 +16419,7 @@
         <w:spacing w:after="120" w:line="259" w:lineRule="auto"/>
       </w:pPr>
       <w:r>
-        <w:t>The group-wise comparisons above present Welch's and Student's t-tests side by side. Outcomes with statistically significant Welch tests were: phq9a_-phq9a_total, psc_-psc_total, rcads_-rcads_total, somatic_-somatic_total, bbscq_-bbscq_comitment, wemwbs_-wemwbs_total, bbscq_-bbscq_total.</w:t>
+        <w:t>The group-wise comparisons above present Welch's and Student's t-tests side by side. Outcomes with statistically significant Welch tests: phq9a_-phq9a_total, psc_-psc_total, rcads_-rcads_total, somatic_-somatic_total, bbscq_-bbscq_comitment, wemwbs_-wemwbs_total, bbscq_-bbscq_total.</w:t>
       </w:r>
     </w:p>
     <w:sectPr>
@@ -16438,7 +16465,7 @@
         <w:color w:val="666666"/>
         <w:sz w:val="18"/>
       </w:rPr>
-      <w:t>ODK Analysis Pipeline Report</w:t>
+      <w:t>SMART STEP — Consolidated Report</w:t>
     </w:r>
   </w:p>
 </w:hdr>

</xml_diff>